<commit_message>
Design and paradigmes update
</commit_message>
<xml_diff>
--- a/Documentation/Design.docx
+++ b/Documentation/Design.docx
@@ -13393,14 +13393,28 @@
           <w:color w:val="FFFFFF" w:themeColor="background1"/>
           <w:lang w:val="en-US"/>
         </w:rPr>
-        <w:t xml:space="preserve">Y: </w:t>
+        <w:t>Y</w:t>
+      </w:r>
+      <w:r>
+        <w:rPr>
+          <w:color w:val="FFFFFF" w:themeColor="background1"/>
+          <w:lang w:val="en-US"/>
+        </w:rPr>
+        <w:t xml:space="preserve">: </w:t>
       </w:r>
       <w:r>
         <w:rPr>
           <w:color w:val="70AD47" w:themeColor="accent6"/>
           <w:lang w:val="en-US"/>
         </w:rPr>
-        <w:t xml:space="preserve">int </w:t>
+        <w:t>int</w:t>
+      </w:r>
+      <w:r>
+        <w:rPr>
+          <w:color w:val="70AD47" w:themeColor="accent6"/>
+          <w:lang w:val="en-US"/>
+        </w:rPr>
+        <w:t xml:space="preserve"> </w:t>
       </w:r>
       <w:r>
         <w:rPr>
@@ -13430,7 +13444,21 @@
           <w:color w:val="FFFFFF" w:themeColor="background1"/>
           <w:lang w:val="en-US"/>
         </w:rPr>
-        <w:t>MSL::X</w:t>
+        <w:t>MSL</w:t>
+      </w:r>
+      <w:r>
+        <w:rPr>
+          <w:color w:val="FFFFFF" w:themeColor="background1"/>
+          <w:lang w:val="en-US"/>
+        </w:rPr>
+        <w:t>::</w:t>
+      </w:r>
+      <w:r>
+        <w:rPr>
+          <w:color w:val="FFFFFF" w:themeColor="background1"/>
+          <w:lang w:val="en-US"/>
+        </w:rPr>
+        <w:t>X</w:t>
       </w:r>
     </w:p>
     <w:p>
@@ -14778,7 +14806,97 @@
           <w:color w:val="FFFFFF" w:themeColor="background1"/>
           <w:lang w:val="en-US"/>
         </w:rPr>
+        <w:t xml:space="preserve">, </w:t>
+      </w:r>
+      <w:r>
+        <w:rPr>
+          <w:color w:val="FFC000" w:themeColor="accent4"/>
+          <w:lang w:val="en-US"/>
+        </w:rPr>
+        <w:t>“</w:t>
+      </w:r>
+      <w:proofErr w:type="spellStart"/>
+      <w:r>
+        <w:rPr>
+          <w:color w:val="FFC000" w:themeColor="accent4"/>
+          <w:lang w:val="en-US"/>
+        </w:rPr>
+        <w:t>return_type</w:t>
+      </w:r>
+      <w:proofErr w:type="spellEnd"/>
+      <w:r>
+        <w:rPr>
+          <w:color w:val="FFC000" w:themeColor="accent4"/>
+          <w:lang w:val="en-US"/>
+        </w:rPr>
+        <w:t xml:space="preserve">” </w:t>
+      </w:r>
+      <w:r>
+        <w:rPr>
+          <w:color w:val="FFFFFF" w:themeColor="background1"/>
+          <w:lang w:val="en-US"/>
+        </w:rPr>
+        <w:t xml:space="preserve">= </w:t>
+      </w:r>
+      <w:r>
+        <w:rPr>
+          <w:color w:val="70AD47" w:themeColor="accent6"/>
+          <w:lang w:val="en-US"/>
+        </w:rPr>
+        <w:t>int</w:t>
+      </w:r>
+      <w:r>
+        <w:rPr>
+          <w:color w:val="FFFFFF" w:themeColor="background1"/>
+          <w:lang w:val="en-US"/>
+        </w:rPr>
         <w:t>)</w:t>
+      </w:r>
+      <w:r>
+        <w:rPr>
+          <w:color w:val="FFFFFF" w:themeColor="background1"/>
+          <w:lang w:val="en-US"/>
+        </w:rPr>
+        <w:tab/>
+      </w:r>
+      <w:r>
+        <w:rPr>
+          <w:color w:val="808080" w:themeColor="background1" w:themeShade="80"/>
+          <w:lang w:val="en-US"/>
+        </w:rPr>
+        <w:t>//</w:t>
+      </w:r>
+      <w:r>
+        <w:rPr>
+          <w:color w:val="808080" w:themeColor="background1" w:themeShade="80"/>
+        </w:rPr>
+        <w:t>семантических</w:t>
+      </w:r>
+      <w:r>
+        <w:rPr>
+          <w:color w:val="808080" w:themeColor="background1" w:themeShade="80"/>
+          <w:lang w:val="en-US"/>
+        </w:rPr>
+        <w:t xml:space="preserve"> </w:t>
+      </w:r>
+      <w:r>
+        <w:rPr>
+          <w:color w:val="808080" w:themeColor="background1" w:themeShade="80"/>
+        </w:rPr>
+        <w:t>проверок</w:t>
+      </w:r>
+      <w:r>
+        <w:rPr>
+          <w:color w:val="808080" w:themeColor="background1" w:themeShade="80"/>
+          <w:lang w:val="en-US"/>
+        </w:rPr>
+        <w:t xml:space="preserve"> </w:t>
+      </w:r>
+      <w:r>
+        <w:rPr>
+          <w:color w:val="808080" w:themeColor="background1" w:themeShade="80"/>
+        </w:rPr>
+        <w:t>нет</w:t>
       </w:r>
     </w:p>
     <w:p>
@@ -15397,37 +15515,47 @@
         <w:jc w:val="both"/>
         <w:rPr>
           <w:color w:val="FFFFFF" w:themeColor="background1"/>
-          <w:lang w:val="en-US"/>
-        </w:rPr>
-      </w:pPr>
-      <w:r>
-        <w:rPr>
-          <w:color w:val="FFFFFF" w:themeColor="background1"/>
-          <w:lang w:val="en-US"/>
-        </w:rPr>
-        <w:t xml:space="preserve">x: </w:t>
+        </w:rPr>
+      </w:pPr>
+      <w:r>
+        <w:rPr>
+          <w:color w:val="FFFFFF" w:themeColor="background1"/>
+          <w:lang w:val="en-US"/>
+        </w:rPr>
+        <w:t>x</w:t>
+      </w:r>
+      <w:r>
+        <w:rPr>
+          <w:color w:val="FFFFFF" w:themeColor="background1"/>
+        </w:rPr>
+        <w:t xml:space="preserve">: </w:t>
       </w:r>
       <w:r>
         <w:rPr>
           <w:color w:val="70AD47" w:themeColor="accent6"/>
           <w:lang w:val="en-US"/>
         </w:rPr>
-        <w:t xml:space="preserve">int </w:t>
-      </w:r>
-      <w:r>
-        <w:rPr>
-          <w:color w:val="FFFFFF" w:themeColor="background1"/>
-          <w:lang w:val="en-US"/>
+        <w:t>int</w:t>
+      </w:r>
+      <w:r>
+        <w:rPr>
+          <w:color w:val="70AD47" w:themeColor="accent6"/>
+        </w:rPr>
+        <w:t xml:space="preserve"> </w:t>
+      </w:r>
+      <w:r>
+        <w:rPr>
+          <w:color w:val="FFFFFF" w:themeColor="background1"/>
         </w:rPr>
         <w:t xml:space="preserve">= </w:t>
       </w:r>
       <w:r>
         <w:rPr>
           <w:color w:val="ED7D31" w:themeColor="accent2"/>
-          <w:lang w:val="en-US"/>
         </w:rPr>
         <w:t>@</w:t>
       </w:r>
+      <w:proofErr w:type="spellStart"/>
       <w:proofErr w:type="gramStart"/>
       <w:r>
         <w:rPr>
@@ -15436,10 +15564,10 @@
         </w:rPr>
         <w:t>sizeof</w:t>
       </w:r>
-      <w:r>
-        <w:rPr>
-          <w:color w:val="FFFFFF" w:themeColor="background1"/>
-          <w:lang w:val="en-US"/>
+      <w:proofErr w:type="spellEnd"/>
+      <w:r>
+        <w:rPr>
+          <w:color w:val="FFFFFF" w:themeColor="background1"/>
         </w:rPr>
         <w:t>(</w:t>
       </w:r>
@@ -15454,28 +15582,44 @@
       <w:r>
         <w:rPr>
           <w:color w:val="FFFFFF" w:themeColor="background1"/>
-          <w:lang w:val="en-US"/>
         </w:rPr>
         <w:t>)</w:t>
       </w:r>
       <w:r>
         <w:rPr>
           <w:color w:val="FFFFFF" w:themeColor="background1"/>
-          <w:lang w:val="en-US"/>
         </w:rPr>
         <w:t xml:space="preserve"> * </w:t>
       </w:r>
       <w:r>
         <w:rPr>
           <w:color w:val="ED7D31" w:themeColor="accent2"/>
-          <w:lang w:val="en-US"/>
-        </w:rPr>
-        <w:t>@type_id</w:t>
-      </w:r>
-      <w:r>
-        <w:rPr>
-          <w:color w:val="FFFFFF" w:themeColor="background1"/>
-          <w:lang w:val="en-US"/>
+        </w:rPr>
+        <w:t>@</w:t>
+      </w:r>
+      <w:r>
+        <w:rPr>
+          <w:color w:val="ED7D31" w:themeColor="accent2"/>
+          <w:lang w:val="en-US"/>
+        </w:rPr>
+        <w:t>type</w:t>
+      </w:r>
+      <w:r>
+        <w:rPr>
+          <w:color w:val="ED7D31" w:themeColor="accent2"/>
+        </w:rPr>
+        <w:t>_</w:t>
+      </w:r>
+      <w:r>
+        <w:rPr>
+          <w:color w:val="ED7D31" w:themeColor="accent2"/>
+          <w:lang w:val="en-US"/>
+        </w:rPr>
+        <w:t>info</w:t>
+      </w:r>
+      <w:r>
+        <w:rPr>
+          <w:color w:val="FFFFFF" w:themeColor="background1"/>
         </w:rPr>
         <w:t>(</w:t>
       </w:r>
@@ -15489,18 +15633,67 @@
       <w:r>
         <w:rPr>
           <w:color w:val="FFFFFF" w:themeColor="background1"/>
-          <w:lang w:val="en-US"/>
         </w:rPr>
         <w:t>)</w:t>
       </w:r>
-    </w:p>
-    <w:p>
-      <w:pPr>
-        <w:shd w:val="clear" w:color="auto" w:fill="000000" w:themeFill="text1"/>
-        <w:jc w:val="both"/>
-        <w:rPr>
-          <w:color w:val="FFFFFF" w:themeColor="background1"/>
-          <w:lang w:val="en-US"/>
+      <w:r>
+        <w:rPr>
+          <w:color w:val="FFFFFF" w:themeColor="background1"/>
+        </w:rPr>
+        <w:t>.</w:t>
+      </w:r>
+      <w:r>
+        <w:rPr>
+          <w:color w:val="FFFFFF" w:themeColor="background1"/>
+          <w:lang w:val="en-US"/>
+        </w:rPr>
+        <w:t>id</w:t>
+      </w:r>
+      <w:r>
+        <w:rPr>
+          <w:color w:val="FFFFFF" w:themeColor="background1"/>
+        </w:rPr>
+        <w:t xml:space="preserve"> </w:t>
+      </w:r>
+      <w:r>
+        <w:rPr>
+          <w:color w:val="808080" w:themeColor="background1" w:themeShade="80"/>
+        </w:rPr>
+        <w:t>// .</w:t>
+      </w:r>
+      <w:r>
+        <w:rPr>
+          <w:color w:val="808080" w:themeColor="background1" w:themeShade="80"/>
+          <w:lang w:val="en-US"/>
+        </w:rPr>
+        <w:t>is</w:t>
+      </w:r>
+      <w:r>
+        <w:rPr>
+          <w:color w:val="808080" w:themeColor="background1" w:themeShade="80"/>
+        </w:rPr>
+        <w:t>_</w:t>
+      </w:r>
+      <w:r>
+        <w:rPr>
+          <w:color w:val="808080" w:themeColor="background1" w:themeShade="80"/>
+          <w:lang w:val="en-US"/>
+        </w:rPr>
+        <w:t>pod</w:t>
+      </w:r>
+      <w:r>
+        <w:rPr>
+          <w:color w:val="808080" w:themeColor="background1" w:themeShade="80"/>
+        </w:rPr>
+        <w:t xml:space="preserve"> и другие различные флаги </w:t>
+      </w:r>
+    </w:p>
+    <w:p>
+      <w:pPr>
+        <w:shd w:val="clear" w:color="auto" w:fill="000000" w:themeFill="text1"/>
+        <w:jc w:val="both"/>
+        <w:rPr>
+          <w:color w:val="FFFFFF" w:themeColor="background1"/>
         </w:rPr>
       </w:pPr>
     </w:p>
@@ -16199,7 +16392,6 @@
         <w:jc w:val="both"/>
         <w:rPr>
           <w:color w:val="FFFFFF" w:themeColor="background1"/>
-          <w:lang w:val="en-US"/>
         </w:rPr>
       </w:pPr>
       <w:r>
@@ -16226,7 +16418,6 @@
       <w:r>
         <w:rPr>
           <w:color w:val="4472C4" w:themeColor="accent1"/>
-          <w:lang w:val="en-US"/>
         </w:rPr>
         <w:t xml:space="preserve"> </w:t>
       </w:r>
@@ -16240,7 +16431,6 @@
       <w:r>
         <w:rPr>
           <w:color w:val="FFFFFF" w:themeColor="background1"/>
-          <w:lang w:val="en-US"/>
         </w:rPr>
         <w:t xml:space="preserve">; </w:t>
       </w:r>
@@ -16251,13 +16441,11 @@
         <w:jc w:val="both"/>
         <w:rPr>
           <w:color w:val="FFFFFF" w:themeColor="background1"/>
-          <w:lang w:val="en-US"/>
-        </w:rPr>
-      </w:pPr>
-      <w:r>
-        <w:rPr>
-          <w:color w:val="FFFFFF" w:themeColor="background1"/>
-          <w:lang w:val="en-US"/>
+        </w:rPr>
+      </w:pPr>
+      <w:r>
+        <w:rPr>
+          <w:color w:val="FFFFFF" w:themeColor="background1"/>
         </w:rPr>
         <w:t>}</w:t>
       </w:r>
@@ -16268,17 +16456,15 @@
         <w:jc w:val="both"/>
         <w:rPr>
           <w:color w:val="FFFFFF" w:themeColor="background1"/>
-          <w:lang w:val="en-US"/>
-        </w:rPr>
-      </w:pPr>
-    </w:p>
-    <w:p>
-      <w:pPr>
-        <w:shd w:val="clear" w:color="auto" w:fill="000000" w:themeFill="text1"/>
-        <w:jc w:val="both"/>
-        <w:rPr>
-          <w:color w:val="FFFFFF" w:themeColor="background1"/>
-          <w:lang w:val="en-US"/>
+        </w:rPr>
+      </w:pPr>
+    </w:p>
+    <w:p>
+      <w:pPr>
+        <w:shd w:val="clear" w:color="auto" w:fill="000000" w:themeFill="text1"/>
+        <w:jc w:val="both"/>
+        <w:rPr>
+          <w:color w:val="FFFFFF" w:themeColor="background1"/>
         </w:rPr>
       </w:pPr>
       <w:r>
@@ -16291,7 +16477,6 @@
       <w:r>
         <w:rPr>
           <w:color w:val="FFFFFF" w:themeColor="background1"/>
-          <w:lang w:val="en-US"/>
         </w:rPr>
         <w:t xml:space="preserve">: </w:t>
       </w:r>
@@ -16305,14 +16490,12 @@
       <w:r>
         <w:rPr>
           <w:color w:val="70AD47" w:themeColor="accent6"/>
-          <w:lang w:val="en-US"/>
-        </w:rPr>
-        <w:t xml:space="preserve"> </w:t>
-      </w:r>
-      <w:r>
-        <w:rPr>
-          <w:color w:val="FFFFFF" w:themeColor="background1"/>
-          <w:lang w:val="en-US"/>
+        </w:rPr>
+        <w:t xml:space="preserve"> </w:t>
+      </w:r>
+      <w:r>
+        <w:rPr>
+          <w:color w:val="FFFFFF" w:themeColor="background1"/>
         </w:rPr>
         <w:t xml:space="preserve">= </w:t>
       </w:r>
@@ -16326,7 +16509,6 @@
       <w:r>
         <w:rPr>
           <w:color w:val="FFFFFF" w:themeColor="background1"/>
-          <w:lang w:val="en-US"/>
         </w:rPr>
         <w:t>&lt;</w:t>
       </w:r>
@@ -16341,7 +16523,6 @@
       <w:r>
         <w:rPr>
           <w:color w:val="FFFFFF" w:themeColor="background1"/>
-          <w:lang w:val="en-US"/>
         </w:rPr>
         <w:t>&gt;(</w:t>
       </w:r>
@@ -16349,28 +16530,24 @@
       <w:r>
         <w:rPr>
           <w:color w:val="FFFF00"/>
-          <w:lang w:val="en-US"/>
         </w:rPr>
         <w:t>1</w:t>
       </w:r>
       <w:r>
         <w:rPr>
           <w:color w:val="FFFFFF" w:themeColor="background1"/>
-          <w:lang w:val="en-US"/>
         </w:rPr>
         <w:t>,</w:t>
       </w:r>
       <w:r>
         <w:rPr>
           <w:color w:val="FFFF00"/>
-          <w:lang w:val="en-US"/>
         </w:rPr>
         <w:t>2</w:t>
       </w:r>
       <w:r>
         <w:rPr>
           <w:color w:val="FFFFFF" w:themeColor="background1"/>
-          <w:lang w:val="en-US"/>
         </w:rPr>
         <w:t>)</w:t>
       </w:r>
@@ -16381,7 +16558,6 @@
         <w:jc w:val="both"/>
         <w:rPr>
           <w:color w:val="FFFFFF" w:themeColor="background1"/>
-          <w:lang w:val="en-US"/>
         </w:rPr>
       </w:pPr>
     </w:p>
@@ -17443,10 +17619,46 @@
           <w:kern w:val="0"/>
           <w:sz w:val="20"/>
           <w:szCs w:val="20"/>
+          <w:lang w:eastAsia="ru-RU"/>
+          <w14:ligatures w14:val="none"/>
+        </w:rPr>
+      </w:pPr>
+      <w:r>
+        <w:rPr>
+          <w:rFonts w:ascii="Consolas" w:eastAsia="Times New Roman" w:hAnsi="Consolas" w:cs="Courier New"/>
+          <w:color w:val="6CB8E6"/>
+          <w:kern w:val="0"/>
+          <w:sz w:val="20"/>
+          <w:szCs w:val="20"/>
+          <w:lang w:eastAsia="ru-RU"/>
+          <w14:ligatures w14:val="none"/>
+        </w:rPr>
+        <w:t>#</w:t>
+      </w:r>
+      <w:r>
+        <w:rPr>
+          <w:rFonts w:ascii="Consolas" w:eastAsia="Times New Roman" w:hAnsi="Consolas" w:cs="Courier New"/>
+          <w:color w:val="E9AE7E"/>
+          <w:kern w:val="0"/>
+          <w:sz w:val="20"/>
+          <w:szCs w:val="20"/>
           <w:lang w:val="en-US" w:eastAsia="ru-RU"/>
           <w14:ligatures w14:val="none"/>
         </w:rPr>
-      </w:pPr>
+        <w:t>program</w:t>
+      </w:r>
+      <w:r>
+        <w:rPr>
+          <w:rFonts w:ascii="Consolas" w:eastAsia="Times New Roman" w:hAnsi="Consolas" w:cs="Courier New"/>
+          <w:color w:val="6CB8E6"/>
+          <w:kern w:val="0"/>
+          <w:sz w:val="20"/>
+          <w:szCs w:val="20"/>
+          <w:lang w:eastAsia="ru-RU"/>
+          <w14:ligatures w14:val="none"/>
+        </w:rPr>
+        <w:t>_</w:t>
+      </w:r>
       <w:r>
         <w:rPr>
           <w:rFonts w:ascii="Consolas" w:eastAsia="Times New Roman" w:hAnsi="Consolas" w:cs="Courier New"/>
@@ -17457,22 +17669,8 @@
           <w:lang w:val="en-US" w:eastAsia="ru-RU"/>
           <w14:ligatures w14:val="none"/>
         </w:rPr>
-        <w:t>#</w:t>
-      </w:r>
-      <w:proofErr w:type="gramStart"/>
-      <w:r>
-        <w:rPr>
-          <w:rFonts w:ascii="Consolas" w:eastAsia="Times New Roman" w:hAnsi="Consolas" w:cs="Courier New"/>
-          <w:color w:val="E9AE7E"/>
-          <w:kern w:val="0"/>
-          <w:sz w:val="20"/>
-          <w:szCs w:val="20"/>
-          <w:lang w:val="en-US" w:eastAsia="ru-RU"/>
-          <w14:ligatures w14:val="none"/>
-        </w:rPr>
-        <w:t>program</w:t>
-      </w:r>
-      <w:proofErr w:type="gramEnd"/>
+        <w:t>output</w:t>
+      </w:r>
       <w:r>
         <w:rPr>
           <w:rFonts w:ascii="Consolas" w:eastAsia="Times New Roman" w:hAnsi="Consolas" w:cs="Courier New"/>
@@ -17480,34 +17678,22 @@
           <w:kern w:val="0"/>
           <w:sz w:val="20"/>
           <w:szCs w:val="20"/>
-          <w:lang w:val="en-US" w:eastAsia="ru-RU"/>
+          <w:lang w:eastAsia="ru-RU"/>
           <w14:ligatures w14:val="none"/>
         </w:rPr>
-        <w:t>_</w:t>
+        <w:t xml:space="preserve"> </w:t>
       </w:r>
       <w:r>
         <w:rPr>
           <w:rFonts w:ascii="Consolas" w:eastAsia="Times New Roman" w:hAnsi="Consolas" w:cs="Courier New"/>
-          <w:color w:val="6CB8E6"/>
+          <w:color w:val="91D076"/>
           <w:kern w:val="0"/>
           <w:sz w:val="20"/>
           <w:szCs w:val="20"/>
-          <w:lang w:val="en-US" w:eastAsia="ru-RU"/>
+          <w:lang w:eastAsia="ru-RU"/>
           <w14:ligatures w14:val="none"/>
         </w:rPr>
-        <w:t>output</w:t>
-      </w:r>
-      <w:r>
-        <w:rPr>
-          <w:rFonts w:ascii="Consolas" w:eastAsia="Times New Roman" w:hAnsi="Consolas" w:cs="Courier New"/>
-          <w:color w:val="6CB8E6"/>
-          <w:kern w:val="0"/>
-          <w:sz w:val="20"/>
-          <w:szCs w:val="20"/>
-          <w:lang w:val="en-US" w:eastAsia="ru-RU"/>
-          <w14:ligatures w14:val="none"/>
-        </w:rPr>
-        <w:t xml:space="preserve"> </w:t>
+        <w:t>"</w:t>
       </w:r>
       <w:r>
         <w:rPr>
@@ -17519,7 +17705,7 @@
           <w:lang w:val="en-US" w:eastAsia="ru-RU"/>
           <w14:ligatures w14:val="none"/>
         </w:rPr>
-        <w:t>"</w:t>
+        <w:t>build</w:t>
       </w:r>
       <w:r>
         <w:rPr>
@@ -17528,19 +17714,7 @@
           <w:kern w:val="0"/>
           <w:sz w:val="20"/>
           <w:szCs w:val="20"/>
-          <w:lang w:val="en-US" w:eastAsia="ru-RU"/>
-          <w14:ligatures w14:val="none"/>
-        </w:rPr>
-        <w:t>build</w:t>
-      </w:r>
-      <w:r>
-        <w:rPr>
-          <w:rFonts w:ascii="Consolas" w:eastAsia="Times New Roman" w:hAnsi="Consolas" w:cs="Courier New"/>
-          <w:color w:val="91D076"/>
-          <w:kern w:val="0"/>
-          <w:sz w:val="20"/>
-          <w:szCs w:val="20"/>
-          <w:lang w:val="en-US" w:eastAsia="ru-RU"/>
+          <w:lang w:eastAsia="ru-RU"/>
           <w14:ligatures w14:val="none"/>
         </w:rPr>
         <w:t>/"</w:t>
@@ -17552,22 +17726,10 @@
           <w:kern w:val="0"/>
           <w:sz w:val="20"/>
           <w:szCs w:val="20"/>
-          <w:lang w:val="en-US" w:eastAsia="ru-RU"/>
+          <w:lang w:eastAsia="ru-RU"/>
           <w14:ligatures w14:val="none"/>
         </w:rPr>
         <w:t xml:space="preserve">     </w:t>
-      </w:r>
-      <w:r>
-        <w:rPr>
-          <w:rFonts w:ascii="Consolas" w:eastAsia="Times New Roman" w:hAnsi="Consolas" w:cs="Courier New"/>
-          <w:color w:val="8DA1B9"/>
-          <w:kern w:val="0"/>
-          <w:sz w:val="20"/>
-          <w:szCs w:val="20"/>
-          <w:lang w:val="en-US" w:eastAsia="ru-RU"/>
-          <w14:ligatures w14:val="none"/>
-        </w:rPr>
-        <w:t xml:space="preserve">// </w:t>
       </w:r>
       <w:r>
         <w:rPr>
@@ -17579,19 +17741,7 @@
           <w:lang w:eastAsia="ru-RU"/>
           <w14:ligatures w14:val="none"/>
         </w:rPr>
-        <w:t>переопределить</w:t>
-      </w:r>
-      <w:r>
-        <w:rPr>
-          <w:rFonts w:ascii="Consolas" w:eastAsia="Times New Roman" w:hAnsi="Consolas" w:cs="Courier New"/>
-          <w:color w:val="8DA1B9"/>
-          <w:kern w:val="0"/>
-          <w:sz w:val="20"/>
-          <w:szCs w:val="20"/>
-          <w:lang w:val="en-US" w:eastAsia="ru-RU"/>
-          <w14:ligatures w14:val="none"/>
-        </w:rPr>
-        <w:t xml:space="preserve"> </w:t>
+        <w:t xml:space="preserve">// </w:t>
       </w:r>
       <w:r>
         <w:rPr>
@@ -17603,19 +17753,7 @@
           <w:lang w:eastAsia="ru-RU"/>
           <w14:ligatures w14:val="none"/>
         </w:rPr>
-        <w:t>папку</w:t>
-      </w:r>
-      <w:r>
-        <w:rPr>
-          <w:rFonts w:ascii="Consolas" w:eastAsia="Times New Roman" w:hAnsi="Consolas" w:cs="Courier New"/>
-          <w:color w:val="8DA1B9"/>
-          <w:kern w:val="0"/>
-          <w:sz w:val="20"/>
-          <w:szCs w:val="20"/>
-          <w:lang w:val="en-US" w:eastAsia="ru-RU"/>
-          <w14:ligatures w14:val="none"/>
-        </w:rPr>
-        <w:t xml:space="preserve"> </w:t>
+        <w:t>переопределить</w:t>
       </w:r>
       <w:r>
         <w:rPr>
@@ -17627,6 +17765,42 @@
           <w:lang w:eastAsia="ru-RU"/>
           <w14:ligatures w14:val="none"/>
         </w:rPr>
+        <w:t xml:space="preserve"> </w:t>
+      </w:r>
+      <w:r>
+        <w:rPr>
+          <w:rFonts w:ascii="Consolas" w:eastAsia="Times New Roman" w:hAnsi="Consolas" w:cs="Courier New"/>
+          <w:color w:val="8DA1B9"/>
+          <w:kern w:val="0"/>
+          <w:sz w:val="20"/>
+          <w:szCs w:val="20"/>
+          <w:lang w:eastAsia="ru-RU"/>
+          <w14:ligatures w14:val="none"/>
+        </w:rPr>
+        <w:t>папку</w:t>
+      </w:r>
+      <w:r>
+        <w:rPr>
+          <w:rFonts w:ascii="Consolas" w:eastAsia="Times New Roman" w:hAnsi="Consolas" w:cs="Courier New"/>
+          <w:color w:val="8DA1B9"/>
+          <w:kern w:val="0"/>
+          <w:sz w:val="20"/>
+          <w:szCs w:val="20"/>
+          <w:lang w:eastAsia="ru-RU"/>
+          <w14:ligatures w14:val="none"/>
+        </w:rPr>
+        <w:t xml:space="preserve"> </w:t>
+      </w:r>
+      <w:r>
+        <w:rPr>
+          <w:rFonts w:ascii="Consolas" w:eastAsia="Times New Roman" w:hAnsi="Consolas" w:cs="Courier New"/>
+          <w:color w:val="8DA1B9"/>
+          <w:kern w:val="0"/>
+          <w:sz w:val="20"/>
+          <w:szCs w:val="20"/>
+          <w:lang w:eastAsia="ru-RU"/>
+          <w14:ligatures w14:val="none"/>
+        </w:rPr>
         <w:t>вывода</w:t>
       </w:r>
     </w:p>
@@ -18170,12 +18344,14 @@
         <w:rPr>
           <w:rFonts w:ascii="Consolas" w:hAnsi="Consolas"/>
           <w:color w:val="F9FAFB"/>
+          <w:lang w:val="en-US"/>
         </w:rPr>
       </w:pPr>
       <w:r>
         <w:rPr>
           <w:rFonts w:ascii="Consolas" w:hAnsi="Consolas"/>
           <w:color w:val="F9FAFB"/>
+          <w:lang w:val="en-US"/>
         </w:rPr>
         <w:t>@</w:t>
       </w:r>
@@ -18193,6 +18369,7 @@
           <w:rStyle w:val="token"/>
           <w:rFonts w:ascii="Consolas" w:hAnsi="Consolas"/>
           <w:color w:val="C699E3"/>
+          <w:lang w:val="en-US"/>
         </w:rPr>
         <w:t>_</w:t>
       </w:r>
@@ -18211,6 +18388,7 @@
           <w:rStyle w:val="token"/>
           <w:rFonts w:ascii="Consolas" w:hAnsi="Consolas"/>
           <w:color w:val="E3EAF2"/>
+          <w:lang w:val="en-US"/>
         </w:rPr>
         <w:t>(</w:t>
       </w:r>
@@ -18228,6 +18406,7 @@
           <w:rStyle w:val="token"/>
           <w:rFonts w:ascii="Consolas" w:hAnsi="Consolas"/>
           <w:color w:val="E3EAF2"/>
+          <w:lang w:val="en-US"/>
         </w:rPr>
         <w:t>)</w:t>
       </w:r>
@@ -19489,81 +19668,54 @@
         <w:t>А</w:t>
       </w:r>
       <w:r>
-        <w:rPr>
-          <w:lang w:val="en-US"/>
-        </w:rPr>
         <w:t xml:space="preserve"> </w:t>
       </w:r>
       <w:r>
         <w:t>сами</w:t>
       </w:r>
       <w:r>
-        <w:rPr>
-          <w:lang w:val="en-US"/>
-        </w:rPr>
         <w:t xml:space="preserve"> </w:t>
       </w:r>
       <w:r>
         <w:t>узлы</w:t>
       </w:r>
       <w:r>
-        <w:rPr>
-          <w:lang w:val="en-US"/>
-        </w:rPr>
         <w:t xml:space="preserve"> </w:t>
       </w:r>
       <w:r>
         <w:t>живут</w:t>
       </w:r>
       <w:r>
-        <w:rPr>
-          <w:lang w:val="en-US"/>
-        </w:rPr>
         <w:t xml:space="preserve"> </w:t>
       </w:r>
       <w:r>
         <w:t>в</w:t>
       </w:r>
       <w:r>
-        <w:rPr>
-          <w:lang w:val="en-US"/>
-        </w:rPr>
         <w:t xml:space="preserve"> </w:t>
       </w:r>
       <w:r>
         <w:t>векторе</w:t>
       </w:r>
       <w:r>
-        <w:rPr>
-          <w:lang w:val="en-US"/>
-        </w:rPr>
         <w:t xml:space="preserve"> </w:t>
       </w:r>
       <w:r>
         <w:t>где</w:t>
       </w:r>
       <w:r>
-        <w:rPr>
-          <w:lang w:val="en-US"/>
-        </w:rPr>
         <w:t>-</w:t>
       </w:r>
       <w:r>
         <w:t>то</w:t>
       </w:r>
       <w:r>
-        <w:rPr>
-          <w:lang w:val="en-US"/>
-        </w:rPr>
         <w:t xml:space="preserve"> </w:t>
       </w:r>
       <w:r>
         <w:t>в</w:t>
       </w:r>
       <w:r>
-        <w:rPr>
-          <w:lang w:val="en-US"/>
-        </w:rPr>
         <w:t xml:space="preserve"> </w:t>
       </w:r>
       <w:proofErr w:type="spellStart"/>
@@ -19575,18 +19727,12 @@
       </w:r>
       <w:proofErr w:type="spellEnd"/>
       <w:r>
-        <w:rPr>
-          <w:lang w:val="en-US"/>
-        </w:rPr>
         <w:t xml:space="preserve"> (</w:t>
       </w:r>
       <w:r>
         <w:t>например</w:t>
       </w:r>
       <w:r>
-        <w:rPr>
-          <w:lang w:val="en-US"/>
-        </w:rPr>
         <w:t xml:space="preserve">, </w:t>
       </w:r>
       <w:proofErr w:type="gramStart"/>
@@ -19597,9 +19743,6 @@
         <w:t>std</w:t>
       </w:r>
       <w:r>
-        <w:rPr>
-          <w:lang w:val="en-US"/>
-        </w:rPr>
         <w:t>::</w:t>
       </w:r>
       <w:proofErr w:type="gramEnd"/>
@@ -19610,9 +19753,6 @@
         <w:t>vector</w:t>
       </w:r>
       <w:r>
-        <w:rPr>
-          <w:lang w:val="en-US"/>
-        </w:rPr>
         <w:t>&lt;</w:t>
       </w:r>
       <w:proofErr w:type="spellStart"/>
@@ -19624,9 +19764,6 @@
       </w:r>
       <w:proofErr w:type="spellEnd"/>
       <w:r>
-        <w:rPr>
-          <w:lang w:val="en-US"/>
-        </w:rPr>
         <w:t xml:space="preserve">&gt; </w:t>
       </w:r>
       <w:r>
@@ -19636,9 +19773,6 @@
         <w:t>nodes</w:t>
       </w:r>
       <w:r>
-        <w:rPr>
-          <w:lang w:val="en-US"/>
-        </w:rPr>
         <w:t xml:space="preserve">). </w:t>
       </w:r>
       <w:r>
@@ -20833,6 +20967,11 @@
       </w:r>
     </w:p>
     <w:p>
+      <w:pPr>
+        <w:rPr>
+          <w:lang w:val="en-US"/>
+        </w:rPr>
+      </w:pPr>
       <w:r>
         <w:t xml:space="preserve">С </w:t>
       </w:r>
@@ -20845,8 +20984,12 @@
         <w:t xml:space="preserve"> можно такую же систему сделать... Задать</w:t>
       </w:r>
       <w:r>
-        <w:t xml:space="preserve"> </w:t>
-      </w:r>
+        <w:rPr>
+          <w:lang w:val="en-US"/>
+        </w:rPr>
+        <w:t xml:space="preserve"> </w:t>
+      </w:r>
+      <w:proofErr w:type="spellStart"/>
       <w:r>
         <w:rPr>
           <w:lang w:val="en-US"/>
@@ -20854,6 +20997,9 @@
         <w:t>compilation</w:t>
       </w:r>
       <w:r>
+        <w:rPr>
+          <w:lang w:val="en-US"/>
+        </w:rPr>
         <w:t>_</w:t>
       </w:r>
       <w:r>
@@ -20862,7 +21008,11 @@
         </w:rPr>
         <w:t>pseudonym</w:t>
       </w:r>
-      <w:r>
+      <w:proofErr w:type="spellEnd"/>
+      <w:r>
+        <w:rPr>
+          <w:lang w:val="en-US"/>
+        </w:rPr>
         <w:t xml:space="preserve">. </w:t>
       </w:r>
       <w:proofErr w:type="spellStart"/>
@@ -20871,6 +21021,9 @@
       </w:r>
       <w:proofErr w:type="spellEnd"/>
       <w:r>
+        <w:rPr>
+          <w:lang w:val="en-US"/>
+        </w:rPr>
         <w:t xml:space="preserve"> </w:t>
       </w:r>
       <w:r>
@@ -20880,6 +21033,9 @@
         <w:t>X</w:t>
       </w:r>
       <w:r>
+        <w:rPr>
+          <w:lang w:val="en-US"/>
+        </w:rPr>
         <w:t>_</w:t>
       </w:r>
       <w:r>

</xml_diff>